<commit_message>
JURICOM 1.2: estado En gestión, columna y filtro Gestor, anular y cambiar gestor en panel de Compras; bitácora, diagramas y manuales
Co-authored-by: Cursor <cursoragent@cursor.com>
</commit_message>
<xml_diff>
--- a/docs/manual-usuario/Manual-de-Usuario-JURICOM.docx
+++ b/docs/manual-usuario/Manual-de-Usuario-JURICOM.docx
@@ -498,6 +498,49 @@
           <w:rtl w:val="0"/>
         </w:rPr>
         <w:t xml:space="preserve">Trazabilidad del proceso (estados y flujo)</w:t>
+      </w:r>
+    </w:p>
+    <w:p>
+      <w:pPr>
+        <w:keepNext w:val="0"/>
+        <w:keepLines w:val="0"/>
+        <w:pageBreakBefore w:val="0"/>
+        <w:widowControl w:val="1"/>
+        <w:numPr>
+          <w:ilvl w:val="0"/>
+          <w:numId w:val="1"/>
+        </w:numPr>
+        <w:pBdr>
+          <w:top w:space="0" w:sz="0" w:val="nil"/>
+          <w:left w:space="0" w:sz="0" w:val="nil"/>
+          <w:bottom w:space="0" w:sz="0" w:val="nil"/>
+          <w:right w:space="0" w:sz="0" w:val="nil"/>
+          <w:between w:space="0" w:sz="0" w:val="nil"/>
+        </w:pBdr>
+        <w:shd w:fill="auto" w:val="clear"/>
+        <w:spacing w:after="200" w:before="0" w:line="276" w:lineRule="auto"/>
+        <w:ind w:left="360" w:right="0" w:hanging="360"/>
+        <w:jc w:val="left"/>
+        <w:rPr/>
+      </w:pPr>
+      <w:r>
+        <w:rPr>
+          <w:rFonts w:ascii="Calibri" w:cs="Calibri" w:eastAsia="Calibri" w:hAnsi="Calibri"/>
+          <w:b w:val="0"/>
+          <w:bCs w:val="0"/>
+          <w:i w:val="0"/>
+          <w:iCs w:val="0"/>
+          <w:smallCaps w:val="0"/>
+          <w:strike w:val="0"/>
+          <w:color w:val="000000"/>
+          <w:sz w:val="22"/>
+          <w:szCs w:val="22"/>
+          <w:u w:val="none"/>
+          <w:shd w:fill="auto" w:val="clear"/>
+          <w:vertAlign w:val="baseline"/>
+          <w:rtl w:val="0"/>
+        </w:rPr>
+        <w:t>Bitácora de versiones (qué cambió en cada versión)</w:t>
       </w:r>
     </w:p>
     <w:p>
@@ -3511,48 +3554,45 @@
           <w:between w:space="0" w:sz="0" w:val="nil"/>
         </w:pBdr>
         <w:shd w:fill="auto" w:val="clear"/>
-        <w:spacing w:after="0" w:before="0" w:line="276" w:lineRule="auto"/>
+        <w:spacing w:after="200" w:before="0" w:line="276" w:lineRule="auto"/>
         <w:ind w:left="360" w:right="0" w:hanging="360"/>
         <w:jc w:val="left"/>
         <w:rPr/>
       </w:pPr>
       <w:r>
         <w:rPr>
-          <w:rFonts w:ascii="Calibri" w:cs="Calibri" w:eastAsia="Calibri" w:hAnsi="Calibri"/>
-          <w:b w:val="1"/>
-          <w:bCs w:val="1"/>
-          <w:i w:val="0"/>
-          <w:iCs w:val="0"/>
-          <w:smallCaps w:val="0"/>
-          <w:strike w:val="0"/>
-          <w:color w:val="000000"/>
-          <w:sz w:val="22"/>
-          <w:szCs w:val="22"/>
-          <w:u w:val="none"/>
-          <w:shd w:fill="auto" w:val="clear"/>
-          <w:vertAlign w:val="baseline"/>
-          <w:rtl w:val="0"/>
-        </w:rPr>
-        <w:t xml:space="preserve">Cotización:</w:t>
-      </w:r>
-      <w:r>
-        <w:rPr>
-          <w:rFonts w:ascii="Calibri" w:cs="Calibri" w:eastAsia="Calibri" w:hAnsi="Calibri"/>
-          <w:b w:val="0"/>
-          <w:bCs w:val="0"/>
-          <w:i w:val="0"/>
-          <w:iCs w:val="0"/>
-          <w:smallCaps w:val="0"/>
-          <w:strike w:val="0"/>
-          <w:color w:val="000000"/>
-          <w:sz w:val="22"/>
-          <w:szCs w:val="22"/>
-          <w:u w:val="none"/>
-          <w:shd w:fill="auto" w:val="clear"/>
-          <w:vertAlign w:val="baseline"/>
-          <w:rtl w:val="0"/>
-        </w:rPr>
-        <w:t xml:space="preserve"> Compras cotiza con proveedores.</w:t>
+          <w:b/>
+          <w:rFonts w:ascii="Calibri" w:cs="Calibri" w:eastAsia="Calibri" w:hAnsi="Calibri"/>
+          <w:i w:val="0"/>
+          <w:iCs w:val="0"/>
+          <w:smallCaps w:val="0"/>
+          <w:strike w:val="0"/>
+          <w:color w:val="000000"/>
+          <w:sz w:val="22"/>
+          <w:szCs w:val="22"/>
+          <w:u w:val="none"/>
+          <w:shd w:fill="auto" w:val="clear"/>
+          <w:vertAlign w:val="baseline"/>
+          <w:rtl w:val="0"/>
+        </w:rPr>
+        <w:t xml:space="preserve">En gestión:</w:t>
+      </w:r>
+      <w:r>
+        <w:rPr>
+          <w:rFonts w:ascii="Calibri" w:cs="Calibri" w:eastAsia="Calibri" w:hAnsi="Calibri"/>
+          <w:i w:val="0"/>
+          <w:iCs w:val="0"/>
+          <w:smallCaps w:val="0"/>
+          <w:strike w:val="0"/>
+          <w:color w:val="000000"/>
+          <w:sz w:val="22"/>
+          <w:szCs w:val="22"/>
+          <w:u w:val="none"/>
+          <w:shd w:fill="auto" w:val="clear"/>
+          <w:vertAlign w:val="baseline"/>
+          <w:rtl w:val="0"/>
+        </w:rPr>
+        <w:t xml:space="preserve"> Compras tomó la solicitud (queda como gestor) y la revisa antes de cotizar.</w:t>
       </w:r>
     </w:p>
     <w:p>
@@ -3595,7 +3635,7 @@
           <w:vertAlign w:val="baseline"/>
           <w:rtl w:val="0"/>
         </w:rPr>
-        <w:t xml:space="preserve">En Aprobación:</w:t>
+        <w:t xml:space="preserve">Cotización:</w:t>
       </w:r>
       <w:r>
         <w:rPr>
@@ -3614,7 +3654,7 @@
           <w:vertAlign w:val="baseline"/>
           <w:rtl w:val="0"/>
         </w:rPr>
-        <w:t xml:space="preserve"> segunda aprobación (gerencia financiera).</w:t>
+        <w:t xml:space="preserve"> Compras cotiza con proveedores.</w:t>
       </w:r>
     </w:p>
     <w:p>
@@ -3642,41 +3682,38 @@
       </w:pPr>
       <w:r>
         <w:rPr>
-          <w:rFonts w:ascii="Calibri" w:cs="Calibri" w:eastAsia="Calibri" w:hAnsi="Calibri"/>
-          <w:b w:val="1"/>
-          <w:bCs w:val="1"/>
-          <w:i w:val="0"/>
-          <w:iCs w:val="0"/>
-          <w:smallCaps w:val="0"/>
-          <w:strike w:val="0"/>
-          <w:color w:val="000000"/>
-          <w:sz w:val="22"/>
-          <w:szCs w:val="22"/>
-          <w:u w:val="none"/>
-          <w:shd w:fill="auto" w:val="clear"/>
-          <w:vertAlign w:val="baseline"/>
-          <w:rtl w:val="0"/>
-        </w:rPr>
-        <w:t xml:space="preserve">Gestionando servicio / Tramitando OC / Tramitada OC:</w:t>
-      </w:r>
-      <w:r>
-        <w:rPr>
-          <w:rFonts w:ascii="Calibri" w:cs="Calibri" w:eastAsia="Calibri" w:hAnsi="Calibri"/>
-          <w:b w:val="0"/>
-          <w:bCs w:val="0"/>
-          <w:i w:val="0"/>
-          <w:iCs w:val="0"/>
-          <w:smallCaps w:val="0"/>
-          <w:strike w:val="0"/>
-          <w:color w:val="000000"/>
-          <w:sz w:val="22"/>
-          <w:szCs w:val="22"/>
-          <w:u w:val="none"/>
-          <w:shd w:fill="auto" w:val="clear"/>
-          <w:vertAlign w:val="baseline"/>
-          <w:rtl w:val="0"/>
-        </w:rPr>
-        <w:t xml:space="preserve"> Compras ejecuta la compra u orden.</w:t>
+          <w:b/>
+          <w:rFonts w:ascii="Calibri" w:cs="Calibri" w:eastAsia="Calibri" w:hAnsi="Calibri"/>
+          <w:i w:val="0"/>
+          <w:iCs w:val="0"/>
+          <w:smallCaps w:val="0"/>
+          <w:strike w:val="0"/>
+          <w:color w:val="000000"/>
+          <w:sz w:val="22"/>
+          <w:szCs w:val="22"/>
+          <w:u w:val="none"/>
+          <w:shd w:fill="auto" w:val="clear"/>
+          <w:vertAlign w:val="baseline"/>
+          <w:rtl w:val="0"/>
+        </w:rPr>
+        <w:t xml:space="preserve">En Aprobación:</w:t>
+      </w:r>
+      <w:r>
+        <w:rPr>
+          <w:rFonts w:ascii="Calibri" w:cs="Calibri" w:eastAsia="Calibri" w:hAnsi="Calibri"/>
+          <w:i w:val="0"/>
+          <w:iCs w:val="0"/>
+          <w:smallCaps w:val="0"/>
+          <w:strike w:val="0"/>
+          <w:color w:val="000000"/>
+          <w:sz w:val="22"/>
+          <w:szCs w:val="22"/>
+          <w:u w:val="none"/>
+          <w:shd w:fill="auto" w:val="clear"/>
+          <w:vertAlign w:val="baseline"/>
+          <w:rtl w:val="0"/>
+        </w:rPr>
+        <w:t xml:space="preserve"> segunda aprobación (líder, Gerencia Financiera o Gerencia General, según elija Compras).</w:t>
       </w:r>
     </w:p>
     <w:p>
@@ -3697,6 +3734,68 @@
           <w:between w:space="0" w:sz="0" w:val="nil"/>
         </w:pBdr>
         <w:shd w:fill="auto" w:val="clear"/>
+        <w:spacing w:after="0" w:before="0" w:line="276" w:lineRule="auto"/>
+        <w:ind w:left="360" w:right="0" w:hanging="360"/>
+        <w:jc w:val="left"/>
+        <w:rPr/>
+      </w:pPr>
+      <w:r>
+        <w:rPr>
+          <w:rFonts w:ascii="Calibri" w:cs="Calibri" w:eastAsia="Calibri" w:hAnsi="Calibri"/>
+          <w:b w:val="1"/>
+          <w:bCs w:val="1"/>
+          <w:i w:val="0"/>
+          <w:iCs w:val="0"/>
+          <w:smallCaps w:val="0"/>
+          <w:strike w:val="0"/>
+          <w:color w:val="000000"/>
+          <w:sz w:val="22"/>
+          <w:szCs w:val="22"/>
+          <w:u w:val="none"/>
+          <w:shd w:fill="auto" w:val="clear"/>
+          <w:vertAlign w:val="baseline"/>
+          <w:rtl w:val="0"/>
+        </w:rPr>
+        <w:t xml:space="preserve">Gestionando servicio / Tramitando OC / Tramitada OC:</w:t>
+      </w:r>
+      <w:r>
+        <w:rPr>
+          <w:rFonts w:ascii="Calibri" w:cs="Calibri" w:eastAsia="Calibri" w:hAnsi="Calibri"/>
+          <w:b w:val="0"/>
+          <w:bCs w:val="0"/>
+          <w:i w:val="0"/>
+          <w:iCs w:val="0"/>
+          <w:smallCaps w:val="0"/>
+          <w:strike w:val="0"/>
+          <w:color w:val="000000"/>
+          <w:sz w:val="22"/>
+          <w:szCs w:val="22"/>
+          <w:u w:val="none"/>
+          <w:shd w:fill="auto" w:val="clear"/>
+          <w:vertAlign w:val="baseline"/>
+          <w:rtl w:val="0"/>
+        </w:rPr>
+        <w:t xml:space="preserve"> Compras ejecuta la compra u orden.</w:t>
+      </w:r>
+    </w:p>
+    <w:p>
+      <w:pPr>
+        <w:keepNext w:val="0"/>
+        <w:keepLines w:val="0"/>
+        <w:pageBreakBefore w:val="0"/>
+        <w:widowControl w:val="1"/>
+        <w:numPr>
+          <w:ilvl w:val="0"/>
+          <w:numId w:val="1"/>
+        </w:numPr>
+        <w:pBdr>
+          <w:top w:space="0" w:sz="0" w:val="nil"/>
+          <w:left w:space="0" w:sz="0" w:val="nil"/>
+          <w:bottom w:space="0" w:sz="0" w:val="nil"/>
+          <w:right w:space="0" w:sz="0" w:val="nil"/>
+          <w:between w:space="0" w:sz="0" w:val="nil"/>
+        </w:pBdr>
+        <w:shd w:fill="auto" w:val="clear"/>
         <w:spacing w:after="200" w:before="0" w:line="276" w:lineRule="auto"/>
         <w:ind w:left="360" w:right="0" w:hanging="360"/>
         <w:jc w:val="left"/>
@@ -3764,6 +3863,17 @@
           <w:rtl w:val="0"/>
         </w:rPr>
         <w:t xml:space="preserve">.</w:t>
+      </w:r>
+    </w:p>
+    <w:p>
+      <w:pPr>
+        <w:rPr/>
+      </w:pPr>
+      <w:r>
+        <w:rPr>
+          <w:rtl w:val="0"/>
+        </w:rPr>
+        <w:t xml:space="preserve">Compras también puede anular una solicitud antes de la orden de compra (En gestión, Programar visita o Cotización) escribiendo el motivo; se avisa por correo al supervisor y al líder.</w:t>
       </w:r>
     </w:p>
     <w:p>
@@ -4988,6 +5098,40 @@
               <w:rPr>
                 <w:rtl w:val="0"/>
               </w:rPr>
+              <w:t>En gestión</w:t>
+            </w:r>
+          </w:p>
+        </w:tc>
+        <w:tc>
+          <w:tcPr/>
+          <w:p>
+            <w:pPr>
+              <w:rPr/>
+            </w:pPr>
+            <w:r>
+              <w:rPr>
+                <w:rtl w:val="0"/>
+              </w:rPr>
+              <w:t>Compras la tomó (tiene gestor) y la revisa antes de cotizar.</w:t>
+            </w:r>
+          </w:p>
+        </w:tc>
+      </w:tr>
+      <w:tr>
+        <w:trPr>
+          <w:cantSplit w:val="0"/>
+          <w:tblHeader w:val="0"/>
+        </w:trPr>
+        <w:tc>
+          <w:tcPr/>
+          <w:p>
+            <w:pPr>
+              <w:rPr/>
+            </w:pPr>
+            <w:r>
+              <w:rPr>
+                <w:rtl w:val="0"/>
+              </w:rPr>
               <w:t xml:space="preserve">Revisión de solicitud (Proyectos)</w:t>
             </w:r>
           </w:p>
@@ -5104,7 +5248,7 @@
               <w:rPr>
                 <w:rtl w:val="0"/>
               </w:rPr>
-              <w:t xml:space="preserve">Segunda aprobación (gerencia financiera).</w:t>
+              <w:t>Segunda aprobación (la persona que elija Compras).</w:t>
             </w:r>
           </w:p>
         </w:tc>
@@ -5376,7 +5520,7 @@
               <w:rPr>
                 <w:rtl w:val="0"/>
               </w:rPr>
-              <w:t xml:space="preserve">Anulada.</w:t>
+              <w:t>Rechazada o anulada por Compras (el motivo queda en el historial).</w:t>
             </w:r>
           </w:p>
         </w:tc>
@@ -7436,6 +7580,17 @@
     </w:p>
     <w:p>
       <w:pPr>
+        <w:rPr/>
+      </w:pPr>
+      <w:r>
+        <w:rPr>
+          <w:rtl w:val="0"/>
+        </w:rPr>
+        <w:t xml:space="preserve">En el panel de Compras, el Administrador puede anular solicitudes y cambiar el gestor de cualquier solicitud, aunque no sea el gestor asignado.</w:t>
+      </w:r>
+    </w:p>
+    <w:p>
+      <w:pPr>
         <w:pStyle w:val="Heading2"/>
         <w:rPr/>
       </w:pPr>
@@ -10188,6 +10343,17 @@
     </w:p>
     <w:p>
       <w:pPr>
+        <w:rPr/>
+      </w:pPr>
+      <w:r>
+        <w:rPr>
+          <w:rtl w:val="0"/>
+        </w:rPr>
+        <w:t xml:space="preserve">Si Compras anula tu solicitud, te llega un correo con el motivo y la verás en estado Cancelado; el motivo queda en las observaciones y en el historial.</w:t>
+      </w:r>
+    </w:p>
+    <w:p>
+      <w:pPr>
         <w:shd w:fill="fff7e6" w:val="clear"/>
         <w:ind w:left="360" w:firstLine="0"/>
         <w:rPr/>
@@ -11382,6 +11548,165 @@
     </w:p>
     <w:p>
       <w:pPr>
+        <w:keepNext w:val="0"/>
+        <w:keepLines w:val="0"/>
+        <w:pageBreakBefore w:val="0"/>
+        <w:widowControl w:val="1"/>
+        <w:numPr>
+          <w:ilvl w:val="0"/>
+          <w:numId w:val="1"/>
+        </w:numPr>
+        <w:pBdr>
+          <w:top w:space="0" w:sz="0" w:val="nil"/>
+          <w:left w:space="0" w:sz="0" w:val="nil"/>
+          <w:bottom w:space="0" w:sz="0" w:val="nil"/>
+          <w:right w:space="0" w:sz="0" w:val="nil"/>
+          <w:between w:space="0" w:sz="0" w:val="nil"/>
+        </w:pBdr>
+        <w:shd w:fill="auto" w:val="clear"/>
+        <w:spacing w:after="200" w:before="0" w:line="276" w:lineRule="auto"/>
+        <w:ind w:left="360" w:right="0" w:hanging="360"/>
+        <w:jc w:val="left"/>
+        <w:rPr/>
+      </w:pPr>
+      <w:r>
+        <w:rPr>
+          <w:b/>
+          <w:rFonts w:ascii="Calibri" w:cs="Calibri" w:eastAsia="Calibri" w:hAnsi="Calibri"/>
+          <w:i w:val="0"/>
+          <w:iCs w:val="0"/>
+          <w:smallCaps w:val="0"/>
+          <w:strike w:val="0"/>
+          <w:color w:val="000000"/>
+          <w:sz w:val="22"/>
+          <w:szCs w:val="22"/>
+          <w:u w:val="none"/>
+          <w:shd w:fill="auto" w:val="clear"/>
+          <w:vertAlign w:val="baseline"/>
+          <w:rtl w:val="0"/>
+        </w:rPr>
+        <w:t xml:space="preserve">Columna Gestor:</w:t>
+      </w:r>
+      <w:r>
+        <w:rPr>
+          <w:rFonts w:ascii="Calibri" w:cs="Calibri" w:eastAsia="Calibri" w:hAnsi="Calibri"/>
+          <w:i w:val="0"/>
+          <w:iCs w:val="0"/>
+          <w:smallCaps w:val="0"/>
+          <w:strike w:val="0"/>
+          <w:color w:val="000000"/>
+          <w:sz w:val="22"/>
+          <w:szCs w:val="22"/>
+          <w:u w:val="none"/>
+          <w:shd w:fill="auto" w:val="clear"/>
+          <w:vertAlign w:val="baseline"/>
+          <w:rtl w:val="0"/>
+        </w:rPr>
+        <w:t xml:space="preserve"> muestra quién gestiona cada solicitud, o "Sin gestor" si nadie la ha tomado.</w:t>
+      </w:r>
+    </w:p>
+    <w:p>
+      <w:pPr>
+        <w:keepNext w:val="0"/>
+        <w:keepLines w:val="0"/>
+        <w:pageBreakBefore w:val="0"/>
+        <w:widowControl w:val="1"/>
+        <w:numPr>
+          <w:ilvl w:val="0"/>
+          <w:numId w:val="1"/>
+        </w:numPr>
+        <w:pBdr>
+          <w:top w:space="0" w:sz="0" w:val="nil"/>
+          <w:left w:space="0" w:sz="0" w:val="nil"/>
+          <w:bottom w:space="0" w:sz="0" w:val="nil"/>
+          <w:right w:space="0" w:sz="0" w:val="nil"/>
+          <w:between w:space="0" w:sz="0" w:val="nil"/>
+        </w:pBdr>
+        <w:shd w:fill="auto" w:val="clear"/>
+        <w:spacing w:after="200" w:before="0" w:line="276" w:lineRule="auto"/>
+        <w:ind w:left="360" w:right="0" w:hanging="360"/>
+        <w:jc w:val="left"/>
+        <w:rPr/>
+      </w:pPr>
+      <w:r>
+        <w:rPr>
+          <w:b/>
+          <w:rFonts w:ascii="Calibri" w:cs="Calibri" w:eastAsia="Calibri" w:hAnsi="Calibri"/>
+          <w:i w:val="0"/>
+          <w:iCs w:val="0"/>
+          <w:smallCaps w:val="0"/>
+          <w:strike w:val="0"/>
+          <w:color w:val="000000"/>
+          <w:sz w:val="22"/>
+          <w:szCs w:val="22"/>
+          <w:u w:val="none"/>
+          <w:shd w:fill="auto" w:val="clear"/>
+          <w:vertAlign w:val="baseline"/>
+          <w:rtl w:val="0"/>
+        </w:rPr>
+        <w:t xml:space="preserve">Filtro de gestor:</w:t>
+      </w:r>
+      <w:r>
+        <w:rPr>
+          <w:rFonts w:ascii="Calibri" w:cs="Calibri" w:eastAsia="Calibri" w:hAnsi="Calibri"/>
+          <w:i w:val="0"/>
+          <w:iCs w:val="0"/>
+          <w:smallCaps w:val="0"/>
+          <w:strike w:val="0"/>
+          <w:color w:val="000000"/>
+          <w:sz w:val="22"/>
+          <w:szCs w:val="22"/>
+          <w:u w:val="none"/>
+          <w:shd w:fill="auto" w:val="clear"/>
+          <w:vertAlign w:val="baseline"/>
+          <w:rtl w:val="0"/>
+        </w:rPr>
+        <w:t xml:space="preserve"> por defecto ves Mías y sin gestor. También puedes elegir Asignadas a mí, Sin gestor, Todos los gestores o un compañero de Compras.</w:t>
+      </w:r>
+    </w:p>
+    <w:p>
+      <w:pPr>
+        <w:keepNext w:val="0"/>
+        <w:keepLines w:val="0"/>
+        <w:pageBreakBefore w:val="0"/>
+        <w:widowControl w:val="1"/>
+        <w:numPr>
+          <w:ilvl w:val="0"/>
+          <w:numId w:val="1"/>
+        </w:numPr>
+        <w:pBdr>
+          <w:top w:space="0" w:sz="0" w:val="nil"/>
+          <w:left w:space="0" w:sz="0" w:val="nil"/>
+          <w:bottom w:space="0" w:sz="0" w:val="nil"/>
+          <w:right w:space="0" w:sz="0" w:val="nil"/>
+          <w:between w:space="0" w:sz="0" w:val="nil"/>
+        </w:pBdr>
+        <w:shd w:fill="auto" w:val="clear"/>
+        <w:spacing w:after="200" w:before="0" w:line="276" w:lineRule="auto"/>
+        <w:ind w:left="360" w:right="0" w:hanging="360"/>
+        <w:jc w:val="left"/>
+        <w:rPr/>
+      </w:pPr>
+      <w:r>
+        <w:rPr>
+          <w:rFonts w:ascii="Calibri" w:cs="Calibri" w:eastAsia="Calibri" w:hAnsi="Calibri"/>
+          <w:i w:val="0"/>
+          <w:iCs w:val="0"/>
+          <w:smallCaps w:val="0"/>
+          <w:strike w:val="0"/>
+          <w:color w:val="000000"/>
+          <w:sz w:val="22"/>
+          <w:szCs w:val="22"/>
+          <w:u w:val="none"/>
+          <w:shd w:fill="auto" w:val="clear"/>
+          <w:vertAlign w:val="baseline"/>
+          <w:rtl w:val="0"/>
+        </w:rPr>
+        <w:t xml:space="preserve">El gestor es informativo: cualquier usuario de Compras puede trabajar cualquier solicitud. Solo anular y cambiar el gestor están reservados al gestor asignado (o al Administrador).</w:t>
+      </w:r>
+    </w:p>
+    <w:p>
+      <w:pPr>
         <w:shd w:fill="eef2f7" w:val="clear"/>
         <w:jc w:val="center"/>
         <w:rPr/>
@@ -11651,7 +11976,7 @@
         <w:widowControl w:val="1"/>
         <w:numPr>
           <w:ilvl w:val="0"/>
-          <w:numId w:val="2"/>
+          <w:numId w:val="1"/>
         </w:numPr>
         <w:pBdr>
           <w:top w:space="0" w:sz="0" w:val="nil"/>
@@ -11661,48 +11986,45 @@
           <w:between w:space="0" w:sz="0" w:val="nil"/>
         </w:pBdr>
         <w:shd w:fill="auto" w:val="clear"/>
-        <w:spacing w:after="0" w:before="0" w:line="276" w:lineRule="auto"/>
-        <w:ind w:left="720" w:right="0" w:hanging="360"/>
+        <w:spacing w:after="200" w:before="0" w:line="276" w:lineRule="auto"/>
+        <w:ind w:left="360" w:right="0" w:hanging="360"/>
         <w:jc w:val="left"/>
         <w:rPr/>
       </w:pPr>
       <w:r>
         <w:rPr>
-          <w:rFonts w:ascii="Calibri" w:cs="Calibri" w:eastAsia="Calibri" w:hAnsi="Calibri"/>
-          <w:b w:val="1"/>
-          <w:bCs w:val="1"/>
-          <w:i w:val="0"/>
-          <w:iCs w:val="0"/>
-          <w:smallCaps w:val="0"/>
-          <w:strike w:val="0"/>
-          <w:color w:val="000000"/>
-          <w:sz w:val="22"/>
-          <w:szCs w:val="22"/>
-          <w:u w:val="none"/>
-          <w:shd w:fill="auto" w:val="clear"/>
-          <w:vertAlign w:val="baseline"/>
-          <w:rtl w:val="0"/>
-        </w:rPr>
-        <w:t xml:space="preserve">Cotizar:</w:t>
-      </w:r>
-      <w:r>
-        <w:rPr>
-          <w:rFonts w:ascii="Calibri" w:cs="Calibri" w:eastAsia="Calibri" w:hAnsi="Calibri"/>
-          <w:b w:val="0"/>
-          <w:bCs w:val="0"/>
-          <w:i w:val="0"/>
-          <w:iCs w:val="0"/>
-          <w:smallCaps w:val="0"/>
-          <w:strike w:val="0"/>
-          <w:color w:val="000000"/>
-          <w:sz w:val="22"/>
-          <w:szCs w:val="22"/>
-          <w:u w:val="none"/>
-          <w:shd w:fill="auto" w:val="clear"/>
-          <w:vertAlign w:val="baseline"/>
-          <w:rtl w:val="0"/>
-        </w:rPr>
-        <w:t xml:space="preserve"> registra la cotización y el/los proveedores.</w:t>
+          <w:b/>
+          <w:rFonts w:ascii="Calibri" w:cs="Calibri" w:eastAsia="Calibri" w:hAnsi="Calibri"/>
+          <w:i w:val="0"/>
+          <w:iCs w:val="0"/>
+          <w:smallCaps w:val="0"/>
+          <w:strike w:val="0"/>
+          <w:color w:val="000000"/>
+          <w:sz w:val="22"/>
+          <w:szCs w:val="22"/>
+          <w:u w:val="none"/>
+          <w:shd w:fill="auto" w:val="clear"/>
+          <w:vertAlign w:val="baseline"/>
+          <w:rtl w:val="0"/>
+        </w:rPr>
+        <w:t xml:space="preserve">Gestionar:</w:t>
+      </w:r>
+      <w:r>
+        <w:rPr>
+          <w:rFonts w:ascii="Calibri" w:cs="Calibri" w:eastAsia="Calibri" w:hAnsi="Calibri"/>
+          <w:i w:val="0"/>
+          <w:iCs w:val="0"/>
+          <w:smallCaps w:val="0"/>
+          <w:strike w:val="0"/>
+          <w:color w:val="000000"/>
+          <w:sz w:val="22"/>
+          <w:szCs w:val="22"/>
+          <w:u w:val="none"/>
+          <w:shd w:fill="auto" w:val="clear"/>
+          <w:vertAlign w:val="baseline"/>
+          <w:rtl w:val="0"/>
+        </w:rPr>
+        <w:t xml:space="preserve"> quedas como gestor y la solicitud pasa a En gestión. Revísala y pulsa Pasar a cotización (o pasa a Programar visita si el servicio la requiere).</w:t>
       </w:r>
     </w:p>
     <w:p>
@@ -11745,7 +12067,7 @@
           <w:vertAlign w:val="baseline"/>
           <w:rtl w:val="0"/>
         </w:rPr>
-        <w:t xml:space="preserve">Enviar a aprobación:</w:t>
+        <w:t xml:space="preserve">Cotizar:</w:t>
       </w:r>
       <w:r>
         <w:rPr>
@@ -11764,7 +12086,66 @@
           <w:vertAlign w:val="baseline"/>
           <w:rtl w:val="0"/>
         </w:rPr>
-        <w:t xml:space="preserve"> pásala a la segunda aprobación (gerencia financiera).</w:t>
+        <w:t xml:space="preserve"> registra la cotización y el/los proveedores.</w:t>
+      </w:r>
+    </w:p>
+    <w:p>
+      <w:pPr>
+        <w:keepNext w:val="0"/>
+        <w:keepLines w:val="0"/>
+        <w:pageBreakBefore w:val="0"/>
+        <w:widowControl w:val="1"/>
+        <w:numPr>
+          <w:ilvl w:val="0"/>
+          <w:numId w:val="2"/>
+        </w:numPr>
+        <w:pBdr>
+          <w:top w:space="0" w:sz="0" w:val="nil"/>
+          <w:left w:space="0" w:sz="0" w:val="nil"/>
+          <w:bottom w:space="0" w:sz="0" w:val="nil"/>
+          <w:right w:space="0" w:sz="0" w:val="nil"/>
+          <w:between w:space="0" w:sz="0" w:val="nil"/>
+        </w:pBdr>
+        <w:shd w:fill="auto" w:val="clear"/>
+        <w:spacing w:after="0" w:before="0" w:line="276" w:lineRule="auto"/>
+        <w:ind w:left="720" w:right="0" w:hanging="360"/>
+        <w:jc w:val="left"/>
+        <w:rPr/>
+      </w:pPr>
+      <w:r>
+        <w:rPr>
+          <w:b/>
+          <w:rFonts w:ascii="Calibri" w:cs="Calibri" w:eastAsia="Calibri" w:hAnsi="Calibri"/>
+          <w:i w:val="0"/>
+          <w:iCs w:val="0"/>
+          <w:smallCaps w:val="0"/>
+          <w:strike w:val="0"/>
+          <w:color w:val="000000"/>
+          <w:sz w:val="22"/>
+          <w:szCs w:val="22"/>
+          <w:u w:val="none"/>
+          <w:shd w:fill="auto" w:val="clear"/>
+          <w:vertAlign w:val="baseline"/>
+          <w:rtl w:val="0"/>
+        </w:rPr>
+        <w:t xml:space="preserve">Enviar a aprobación:</w:t>
+      </w:r>
+      <w:r>
+        <w:rPr>
+          <w:rFonts w:ascii="Calibri" w:cs="Calibri" w:eastAsia="Calibri" w:hAnsi="Calibri"/>
+          <w:i w:val="0"/>
+          <w:iCs w:val="0"/>
+          <w:smallCaps w:val="0"/>
+          <w:strike w:val="0"/>
+          <w:color w:val="000000"/>
+          <w:sz w:val="22"/>
+          <w:szCs w:val="22"/>
+          <w:u w:val="none"/>
+          <w:shd w:fill="auto" w:val="clear"/>
+          <w:vertAlign w:val="baseline"/>
+          <w:rtl w:val="0"/>
+        </w:rPr>
+        <w:t xml:space="preserve"> pásala a la segunda aprobación (eliges líder, Gerencia Financiera o Gerencia General).</w:t>
       </w:r>
     </w:p>
     <w:p>
@@ -12159,6 +12540,328 @@
     </w:p>
     <w:p>
       <w:pPr>
+        <w:rPr/>
+      </w:pPr>
+      <w:r>
+        <w:rPr>
+          <w:rtl w:val="0"/>
+        </w:rPr>
+        <w:t xml:space="preserve">Desde En gestión decides qué hacer con una compra de menor cuantía: Continuar a Trámite OC (sin segunda aprobación), Pasar a cotización o Enviar a aprobación del líder.</w:t>
+      </w:r>
+    </w:p>
+    <w:p>
+      <w:pPr>
+        <w:pStyle w:val="Heading3"/>
+        <w:rPr/>
+      </w:pPr>
+      <w:r>
+        <w:rPr>
+          <w:rtl w:val="0"/>
+        </w:rPr>
+        <w:t xml:space="preserve">2.2 Anular una solicitud</w:t>
+      </w:r>
+    </w:p>
+    <w:p>
+      <w:pPr>
+        <w:keepNext w:val="0"/>
+        <w:keepLines w:val="0"/>
+        <w:pageBreakBefore w:val="0"/>
+        <w:widowControl w:val="1"/>
+        <w:numPr>
+          <w:ilvl w:val="0"/>
+          <w:numId w:val="1"/>
+        </w:numPr>
+        <w:pBdr>
+          <w:top w:space="0" w:sz="0" w:val="nil"/>
+          <w:left w:space="0" w:sz="0" w:val="nil"/>
+          <w:bottom w:space="0" w:sz="0" w:val="nil"/>
+          <w:right w:space="0" w:sz="0" w:val="nil"/>
+          <w:between w:space="0" w:sz="0" w:val="nil"/>
+        </w:pBdr>
+        <w:shd w:fill="auto" w:val="clear"/>
+        <w:spacing w:after="200" w:before="0" w:line="276" w:lineRule="auto"/>
+        <w:ind w:left="360" w:right="0" w:hanging="360"/>
+        <w:jc w:val="left"/>
+        <w:rPr/>
+      </w:pPr>
+      <w:r>
+        <w:rPr>
+          <w:rFonts w:ascii="Calibri" w:cs="Calibri" w:eastAsia="Calibri" w:hAnsi="Calibri"/>
+          <w:i w:val="0"/>
+          <w:iCs w:val="0"/>
+          <w:smallCaps w:val="0"/>
+          <w:strike w:val="0"/>
+          <w:color w:val="000000"/>
+          <w:sz w:val="22"/>
+          <w:szCs w:val="22"/>
+          <w:u w:val="none"/>
+          <w:shd w:fill="auto" w:val="clear"/>
+          <w:vertAlign w:val="baseline"/>
+          <w:rtl w:val="0"/>
+        </w:rPr>
+        <w:t xml:space="preserve">Solo el gestor asignado (o el Administrador) ve el botón Anular solicitud.</w:t>
+      </w:r>
+    </w:p>
+    <w:p>
+      <w:pPr>
+        <w:keepNext w:val="0"/>
+        <w:keepLines w:val="0"/>
+        <w:pageBreakBefore w:val="0"/>
+        <w:widowControl w:val="1"/>
+        <w:numPr>
+          <w:ilvl w:val="0"/>
+          <w:numId w:val="1"/>
+        </w:numPr>
+        <w:pBdr>
+          <w:top w:space="0" w:sz="0" w:val="nil"/>
+          <w:left w:space="0" w:sz="0" w:val="nil"/>
+          <w:bottom w:space="0" w:sz="0" w:val="nil"/>
+          <w:right w:space="0" w:sz="0" w:val="nil"/>
+          <w:between w:space="0" w:sz="0" w:val="nil"/>
+        </w:pBdr>
+        <w:shd w:fill="auto" w:val="clear"/>
+        <w:spacing w:after="200" w:before="0" w:line="276" w:lineRule="auto"/>
+        <w:ind w:left="360" w:right="0" w:hanging="360"/>
+        <w:jc w:val="left"/>
+        <w:rPr/>
+      </w:pPr>
+      <w:r>
+        <w:rPr>
+          <w:rFonts w:ascii="Calibri" w:cs="Calibri" w:eastAsia="Calibri" w:hAnsi="Calibri"/>
+          <w:i w:val="0"/>
+          <w:iCs w:val="0"/>
+          <w:smallCaps w:val="0"/>
+          <w:strike w:val="0"/>
+          <w:color w:val="000000"/>
+          <w:sz w:val="22"/>
+          <w:szCs w:val="22"/>
+          <w:u w:val="none"/>
+          <w:shd w:fill="auto" w:val="clear"/>
+          <w:vertAlign w:val="baseline"/>
+          <w:rtl w:val="0"/>
+        </w:rPr>
+        <w:t xml:space="preserve">Se puede anular en En gestión, Programar visita o Cotización, es decir, antes de registrar la orden de compra.</w:t>
+      </w:r>
+    </w:p>
+    <w:p>
+      <w:pPr>
+        <w:keepNext w:val="0"/>
+        <w:keepLines w:val="0"/>
+        <w:pageBreakBefore w:val="0"/>
+        <w:widowControl w:val="1"/>
+        <w:numPr>
+          <w:ilvl w:val="0"/>
+          <w:numId w:val="1"/>
+        </w:numPr>
+        <w:pBdr>
+          <w:top w:space="0" w:sz="0" w:val="nil"/>
+          <w:left w:space="0" w:sz="0" w:val="nil"/>
+          <w:bottom w:space="0" w:sz="0" w:val="nil"/>
+          <w:right w:space="0" w:sz="0" w:val="nil"/>
+          <w:between w:space="0" w:sz="0" w:val="nil"/>
+        </w:pBdr>
+        <w:shd w:fill="auto" w:val="clear"/>
+        <w:spacing w:after="200" w:before="0" w:line="276" w:lineRule="auto"/>
+        <w:ind w:left="360" w:right="0" w:hanging="360"/>
+        <w:jc w:val="left"/>
+        <w:rPr/>
+      </w:pPr>
+      <w:r>
+        <w:rPr>
+          <w:rFonts w:ascii="Calibri" w:cs="Calibri" w:eastAsia="Calibri" w:hAnsi="Calibri"/>
+          <w:i w:val="0"/>
+          <w:iCs w:val="0"/>
+          <w:smallCaps w:val="0"/>
+          <w:strike w:val="0"/>
+          <w:color w:val="000000"/>
+          <w:sz w:val="22"/>
+          <w:szCs w:val="22"/>
+          <w:u w:val="none"/>
+          <w:shd w:fill="auto" w:val="clear"/>
+          <w:vertAlign w:val="baseline"/>
+          <w:rtl w:val="0"/>
+        </w:rPr>
+        <w:t xml:space="preserve">Escribe el motivo (obligatorio) y confirma. La solicitud pasa a Cancelado y sale del panel.</w:t>
+      </w:r>
+    </w:p>
+    <w:p>
+      <w:pPr>
+        <w:keepNext w:val="0"/>
+        <w:keepLines w:val="0"/>
+        <w:pageBreakBefore w:val="0"/>
+        <w:widowControl w:val="1"/>
+        <w:numPr>
+          <w:ilvl w:val="0"/>
+          <w:numId w:val="1"/>
+        </w:numPr>
+        <w:pBdr>
+          <w:top w:space="0" w:sz="0" w:val="nil"/>
+          <w:left w:space="0" w:sz="0" w:val="nil"/>
+          <w:bottom w:space="0" w:sz="0" w:val="nil"/>
+          <w:right w:space="0" w:sz="0" w:val="nil"/>
+          <w:between w:space="0" w:sz="0" w:val="nil"/>
+        </w:pBdr>
+        <w:shd w:fill="auto" w:val="clear"/>
+        <w:spacing w:after="200" w:before="0" w:line="276" w:lineRule="auto"/>
+        <w:ind w:left="360" w:right="0" w:hanging="360"/>
+        <w:jc w:val="left"/>
+        <w:rPr/>
+      </w:pPr>
+      <w:r>
+        <w:rPr>
+          <w:rFonts w:ascii="Calibri" w:cs="Calibri" w:eastAsia="Calibri" w:hAnsi="Calibri"/>
+          <w:i w:val="0"/>
+          <w:iCs w:val="0"/>
+          <w:smallCaps w:val="0"/>
+          <w:strike w:val="0"/>
+          <w:color w:val="000000"/>
+          <w:sz w:val="22"/>
+          <w:szCs w:val="22"/>
+          <w:u w:val="none"/>
+          <w:shd w:fill="auto" w:val="clear"/>
+          <w:vertAlign w:val="baseline"/>
+          <w:rtl w:val="0"/>
+        </w:rPr>
+        <w:t xml:space="preserve">El supervisor y el líder reciben un correo con el motivo, que también queda en el historial.</w:t>
+      </w:r>
+    </w:p>
+    <w:p>
+      <w:pPr>
+        <w:pStyle w:val="Heading3"/>
+        <w:rPr/>
+      </w:pPr>
+      <w:r>
+        <w:rPr>
+          <w:rtl w:val="0"/>
+        </w:rPr>
+        <w:t xml:space="preserve">2.3 Cambiar el gestor</w:t>
+      </w:r>
+    </w:p>
+    <w:p>
+      <w:pPr>
+        <w:keepNext w:val="0"/>
+        <w:keepLines w:val="0"/>
+        <w:pageBreakBefore w:val="0"/>
+        <w:widowControl w:val="1"/>
+        <w:numPr>
+          <w:ilvl w:val="0"/>
+          <w:numId w:val="1"/>
+        </w:numPr>
+        <w:pBdr>
+          <w:top w:space="0" w:sz="0" w:val="nil"/>
+          <w:left w:space="0" w:sz="0" w:val="nil"/>
+          <w:bottom w:space="0" w:sz="0" w:val="nil"/>
+          <w:right w:space="0" w:sz="0" w:val="nil"/>
+          <w:between w:space="0" w:sz="0" w:val="nil"/>
+        </w:pBdr>
+        <w:shd w:fill="auto" w:val="clear"/>
+        <w:spacing w:after="200" w:before="0" w:line="276" w:lineRule="auto"/>
+        <w:ind w:left="360" w:right="0" w:hanging="360"/>
+        <w:jc w:val="left"/>
+        <w:rPr/>
+      </w:pPr>
+      <w:r>
+        <w:rPr>
+          <w:rFonts w:ascii="Calibri" w:cs="Calibri" w:eastAsia="Calibri" w:hAnsi="Calibri"/>
+          <w:i w:val="0"/>
+          <w:iCs w:val="0"/>
+          <w:smallCaps w:val="0"/>
+          <w:strike w:val="0"/>
+          <w:color w:val="000000"/>
+          <w:sz w:val="22"/>
+          <w:szCs w:val="22"/>
+          <w:u w:val="none"/>
+          <w:shd w:fill="auto" w:val="clear"/>
+          <w:vertAlign w:val="baseline"/>
+          <w:rtl w:val="0"/>
+        </w:rPr>
+        <w:t xml:space="preserve">Abre la solicitud y pulsa Cambiar gestor (lo ve el gestor asignado, el Administrador, o cualquier usuario de Compras si la solicitud aún no tiene gestor).</w:t>
+      </w:r>
+    </w:p>
+    <w:p>
+      <w:pPr>
+        <w:keepNext w:val="0"/>
+        <w:keepLines w:val="0"/>
+        <w:pageBreakBefore w:val="0"/>
+        <w:widowControl w:val="1"/>
+        <w:numPr>
+          <w:ilvl w:val="0"/>
+          <w:numId w:val="1"/>
+        </w:numPr>
+        <w:pBdr>
+          <w:top w:space="0" w:sz="0" w:val="nil"/>
+          <w:left w:space="0" w:sz="0" w:val="nil"/>
+          <w:bottom w:space="0" w:sz="0" w:val="nil"/>
+          <w:right w:space="0" w:sz="0" w:val="nil"/>
+          <w:between w:space="0" w:sz="0" w:val="nil"/>
+        </w:pBdr>
+        <w:shd w:fill="auto" w:val="clear"/>
+        <w:spacing w:after="200" w:before="0" w:line="276" w:lineRule="auto"/>
+        <w:ind w:left="360" w:right="0" w:hanging="360"/>
+        <w:jc w:val="left"/>
+        <w:rPr/>
+      </w:pPr>
+      <w:r>
+        <w:rPr>
+          <w:rFonts w:ascii="Calibri" w:cs="Calibri" w:eastAsia="Calibri" w:hAnsi="Calibri"/>
+          <w:i w:val="0"/>
+          <w:iCs w:val="0"/>
+          <w:smallCaps w:val="0"/>
+          <w:strike w:val="0"/>
+          <w:color w:val="000000"/>
+          <w:sz w:val="22"/>
+          <w:szCs w:val="22"/>
+          <w:u w:val="none"/>
+          <w:shd w:fill="auto" w:val="clear"/>
+          <w:vertAlign w:val="baseline"/>
+          <w:rtl w:val="0"/>
+        </w:rPr>
+        <w:t xml:space="preserve">Elige al nuevo gestor de Compras y, si quieres, escribe un comentario.</w:t>
+      </w:r>
+    </w:p>
+    <w:p>
+      <w:pPr>
+        <w:keepNext w:val="0"/>
+        <w:keepLines w:val="0"/>
+        <w:pageBreakBefore w:val="0"/>
+        <w:widowControl w:val="1"/>
+        <w:numPr>
+          <w:ilvl w:val="0"/>
+          <w:numId w:val="1"/>
+        </w:numPr>
+        <w:pBdr>
+          <w:top w:space="0" w:sz="0" w:val="nil"/>
+          <w:left w:space="0" w:sz="0" w:val="nil"/>
+          <w:bottom w:space="0" w:sz="0" w:val="nil"/>
+          <w:right w:space="0" w:sz="0" w:val="nil"/>
+          <w:between w:space="0" w:sz="0" w:val="nil"/>
+        </w:pBdr>
+        <w:shd w:fill="auto" w:val="clear"/>
+        <w:spacing w:after="200" w:before="0" w:line="276" w:lineRule="auto"/>
+        <w:ind w:left="360" w:right="0" w:hanging="360"/>
+        <w:jc w:val="left"/>
+        <w:rPr/>
+      </w:pPr>
+      <w:r>
+        <w:rPr>
+          <w:rFonts w:ascii="Calibri" w:cs="Calibri" w:eastAsia="Calibri" w:hAnsi="Calibri"/>
+          <w:i w:val="0"/>
+          <w:iCs w:val="0"/>
+          <w:smallCaps w:val="0"/>
+          <w:strike w:val="0"/>
+          <w:color w:val="000000"/>
+          <w:sz w:val="22"/>
+          <w:szCs w:val="22"/>
+          <w:u w:val="none"/>
+          <w:shd w:fill="auto" w:val="clear"/>
+          <w:vertAlign w:val="baseline"/>
+          <w:rtl w:val="0"/>
+        </w:rPr>
+        <w:t xml:space="preserve">El cambio queda en el historial y al nuevo gestor le llega un correo.</w:t>
+      </w:r>
+    </w:p>
+    <w:p>
+      <w:pPr>
         <w:pStyle w:val="Heading2"/>
         <w:rPr/>
       </w:pPr>
@@ -14351,6 +15054,17 @@
     </w:p>
     <w:p>
       <w:pPr>
+        <w:rPr/>
+      </w:pPr>
+      <w:r>
+        <w:rPr>
+          <w:rtl w:val="0"/>
+        </w:rPr>
+        <w:t xml:space="preserve">Si Compras anula una solicitud de tu área, también te llega un correo con el motivo.</w:t>
+      </w:r>
+    </w:p>
+    <w:p>
+      <w:pPr>
         <w:shd w:fill="fff7e6" w:val="clear"/>
         <w:ind w:left="360" w:firstLine="0"/>
         <w:rPr/>
@@ -17420,6 +18134,886 @@
         <w:rPr>
           <w:rtl w:val="0"/>
         </w:rPr>
+      </w:r>
+    </w:p>
+    <w:p>
+      <w:pPr>
+        <w:pStyle w:val="Heading1"/>
+        <w:rPr/>
+      </w:pPr>
+      <w:r>
+        <w:rPr>
+          <w:rtl w:val="0"/>
+        </w:rPr>
+        <w:t xml:space="preserve">Bitácora de versiones</w:t>
+      </w:r>
+    </w:p>
+    <w:p>
+      <w:pPr>
+        <w:rPr/>
+      </w:pPr>
+      <w:r>
+        <w:rPr>
+          <w:rtl w:val="0"/>
+        </w:rPr>
+        <w:t xml:space="preserve">Cambios de JURICOM por versión. La versión más reciente va primero.</w:t>
+      </w:r>
+    </w:p>
+    <w:p>
+      <w:pPr>
+        <w:pStyle w:val="Heading2"/>
+        <w:rPr/>
+      </w:pPr>
+      <w:r>
+        <w:rPr>
+          <w:rtl w:val="0"/>
+        </w:rPr>
+        <w:t>JURICOM 1.2 — 07/10/2026</w:t>
+      </w:r>
+    </w:p>
+    <w:p>
+      <w:pPr>
+        <w:keepNext w:val="0"/>
+        <w:keepLines w:val="0"/>
+        <w:pageBreakBefore w:val="0"/>
+        <w:widowControl w:val="1"/>
+        <w:numPr>
+          <w:ilvl w:val="0"/>
+          <w:numId w:val="1"/>
+        </w:numPr>
+        <w:pBdr>
+          <w:top w:space="0" w:sz="0" w:val="nil"/>
+          <w:left w:space="0" w:sz="0" w:val="nil"/>
+          <w:bottom w:space="0" w:sz="0" w:val="nil"/>
+          <w:right w:space="0" w:sz="0" w:val="nil"/>
+          <w:between w:space="0" w:sz="0" w:val="nil"/>
+        </w:pBdr>
+        <w:shd w:fill="auto" w:val="clear"/>
+        <w:spacing w:after="200" w:before="0" w:line="276" w:lineRule="auto"/>
+        <w:ind w:left="360" w:right="0" w:hanging="360"/>
+        <w:jc w:val="left"/>
+        <w:rPr/>
+      </w:pPr>
+      <w:r>
+        <w:rPr>
+          <w:b/>
+          <w:rFonts w:ascii="Calibri" w:cs="Calibri" w:eastAsia="Calibri" w:hAnsi="Calibri"/>
+          <w:i w:val="0"/>
+          <w:iCs w:val="0"/>
+          <w:smallCaps w:val="0"/>
+          <w:strike w:val="0"/>
+          <w:color w:val="000000"/>
+          <w:sz w:val="22"/>
+          <w:szCs w:val="22"/>
+          <w:u w:val="none"/>
+          <w:shd w:fill="auto" w:val="clear"/>
+          <w:vertAlign w:val="baseline"/>
+          <w:rtl w:val="0"/>
+        </w:rPr>
+        <w:t xml:space="preserve">Columna y filtro Gestor</w:t>
+      </w:r>
+      <w:r>
+        <w:rPr>
+          <w:rFonts w:ascii="Calibri" w:cs="Calibri" w:eastAsia="Calibri" w:hAnsi="Calibri"/>
+          <w:i w:val="0"/>
+          <w:iCs w:val="0"/>
+          <w:smallCaps w:val="0"/>
+          <w:strike w:val="0"/>
+          <w:color w:val="000000"/>
+          <w:sz w:val="22"/>
+          <w:szCs w:val="22"/>
+          <w:u w:val="none"/>
+          <w:shd w:fill="auto" w:val="clear"/>
+          <w:vertAlign w:val="baseline"/>
+          <w:rtl w:val="0"/>
+        </w:rPr>
+        <w:t xml:space="preserve"> en el panel de Compras (por defecto: Mías y sin gestor).</w:t>
+      </w:r>
+    </w:p>
+    <w:p>
+      <w:pPr>
+        <w:keepNext w:val="0"/>
+        <w:keepLines w:val="0"/>
+        <w:pageBreakBefore w:val="0"/>
+        <w:widowControl w:val="1"/>
+        <w:numPr>
+          <w:ilvl w:val="0"/>
+          <w:numId w:val="1"/>
+        </w:numPr>
+        <w:pBdr>
+          <w:top w:space="0" w:sz="0" w:val="nil"/>
+          <w:left w:space="0" w:sz="0" w:val="nil"/>
+          <w:bottom w:space="0" w:sz="0" w:val="nil"/>
+          <w:right w:space="0" w:sz="0" w:val="nil"/>
+          <w:between w:space="0" w:sz="0" w:val="nil"/>
+        </w:pBdr>
+        <w:shd w:fill="auto" w:val="clear"/>
+        <w:spacing w:after="200" w:before="0" w:line="276" w:lineRule="auto"/>
+        <w:ind w:left="360" w:right="0" w:hanging="360"/>
+        <w:jc w:val="left"/>
+        <w:rPr/>
+      </w:pPr>
+      <w:r>
+        <w:rPr>
+          <w:b/>
+          <w:rFonts w:ascii="Calibri" w:cs="Calibri" w:eastAsia="Calibri" w:hAnsi="Calibri"/>
+          <w:i w:val="0"/>
+          <w:iCs w:val="0"/>
+          <w:smallCaps w:val="0"/>
+          <w:strike w:val="0"/>
+          <w:color w:val="000000"/>
+          <w:sz w:val="22"/>
+          <w:szCs w:val="22"/>
+          <w:u w:val="none"/>
+          <w:shd w:fill="auto" w:val="clear"/>
+          <w:vertAlign w:val="baseline"/>
+          <w:rtl w:val="0"/>
+        </w:rPr>
+        <w:t xml:space="preserve">Nuevo estado En gestión:</w:t>
+      </w:r>
+      <w:r>
+        <w:rPr>
+          <w:rFonts w:ascii="Calibri" w:cs="Calibri" w:eastAsia="Calibri" w:hAnsi="Calibri"/>
+          <w:i w:val="0"/>
+          <w:iCs w:val="0"/>
+          <w:smallCaps w:val="0"/>
+          <w:strike w:val="0"/>
+          <w:color w:val="000000"/>
+          <w:sz w:val="22"/>
+          <w:szCs w:val="22"/>
+          <w:u w:val="none"/>
+          <w:shd w:fill="auto" w:val="clear"/>
+          <w:vertAlign w:val="baseline"/>
+          <w:rtl w:val="0"/>
+        </w:rPr>
+        <w:t xml:space="preserve"> al pulsar Gestionar, Compras revisa la solicitud y luego la pasa a cotización.</w:t>
+      </w:r>
+    </w:p>
+    <w:p>
+      <w:pPr>
+        <w:keepNext w:val="0"/>
+        <w:keepLines w:val="0"/>
+        <w:pageBreakBefore w:val="0"/>
+        <w:widowControl w:val="1"/>
+        <w:numPr>
+          <w:ilvl w:val="0"/>
+          <w:numId w:val="1"/>
+        </w:numPr>
+        <w:pBdr>
+          <w:top w:space="0" w:sz="0" w:val="nil"/>
+          <w:left w:space="0" w:sz="0" w:val="nil"/>
+          <w:bottom w:space="0" w:sz="0" w:val="nil"/>
+          <w:right w:space="0" w:sz="0" w:val="nil"/>
+          <w:between w:space="0" w:sz="0" w:val="nil"/>
+        </w:pBdr>
+        <w:shd w:fill="auto" w:val="clear"/>
+        <w:spacing w:after="200" w:before="0" w:line="276" w:lineRule="auto"/>
+        <w:ind w:left="360" w:right="0" w:hanging="360"/>
+        <w:jc w:val="left"/>
+        <w:rPr/>
+      </w:pPr>
+      <w:r>
+        <w:rPr>
+          <w:b/>
+          <w:rFonts w:ascii="Calibri" w:cs="Calibri" w:eastAsia="Calibri" w:hAnsi="Calibri"/>
+          <w:i w:val="0"/>
+          <w:iCs w:val="0"/>
+          <w:smallCaps w:val="0"/>
+          <w:strike w:val="0"/>
+          <w:color w:val="000000"/>
+          <w:sz w:val="22"/>
+          <w:szCs w:val="22"/>
+          <w:u w:val="none"/>
+          <w:shd w:fill="auto" w:val="clear"/>
+          <w:vertAlign w:val="baseline"/>
+          <w:rtl w:val="0"/>
+        </w:rPr>
+        <w:t xml:space="preserve">Menor cuantía:</w:t>
+      </w:r>
+      <w:r>
+        <w:rPr>
+          <w:rFonts w:ascii="Calibri" w:cs="Calibri" w:eastAsia="Calibri" w:hAnsi="Calibri"/>
+          <w:i w:val="0"/>
+          <w:iCs w:val="0"/>
+          <w:smallCaps w:val="0"/>
+          <w:strike w:val="0"/>
+          <w:color w:val="000000"/>
+          <w:sz w:val="22"/>
+          <w:szCs w:val="22"/>
+          <w:u w:val="none"/>
+          <w:shd w:fill="auto" w:val="clear"/>
+          <w:vertAlign w:val="baseline"/>
+          <w:rtl w:val="0"/>
+        </w:rPr>
+        <w:t xml:space="preserve"> la decisión (directo a OC, cotizar o devolver al líder) se toma en En gestión.</w:t>
+      </w:r>
+    </w:p>
+    <w:p>
+      <w:pPr>
+        <w:keepNext w:val="0"/>
+        <w:keepLines w:val="0"/>
+        <w:pageBreakBefore w:val="0"/>
+        <w:widowControl w:val="1"/>
+        <w:numPr>
+          <w:ilvl w:val="0"/>
+          <w:numId w:val="1"/>
+        </w:numPr>
+        <w:pBdr>
+          <w:top w:space="0" w:sz="0" w:val="nil"/>
+          <w:left w:space="0" w:sz="0" w:val="nil"/>
+          <w:bottom w:space="0" w:sz="0" w:val="nil"/>
+          <w:right w:space="0" w:sz="0" w:val="nil"/>
+          <w:between w:space="0" w:sz="0" w:val="nil"/>
+        </w:pBdr>
+        <w:shd w:fill="auto" w:val="clear"/>
+        <w:spacing w:after="200" w:before="0" w:line="276" w:lineRule="auto"/>
+        <w:ind w:left="360" w:right="0" w:hanging="360"/>
+        <w:jc w:val="left"/>
+        <w:rPr/>
+      </w:pPr>
+      <w:r>
+        <w:rPr>
+          <w:b/>
+          <w:rFonts w:ascii="Calibri" w:cs="Calibri" w:eastAsia="Calibri" w:hAnsi="Calibri"/>
+          <w:i w:val="0"/>
+          <w:iCs w:val="0"/>
+          <w:smallCaps w:val="0"/>
+          <w:strike w:val="0"/>
+          <w:color w:val="000000"/>
+          <w:sz w:val="22"/>
+          <w:szCs w:val="22"/>
+          <w:u w:val="none"/>
+          <w:shd w:fill="auto" w:val="clear"/>
+          <w:vertAlign w:val="baseline"/>
+          <w:rtl w:val="0"/>
+        </w:rPr>
+        <w:t xml:space="preserve">Anular solicitud:</w:t>
+      </w:r>
+      <w:r>
+        <w:rPr>
+          <w:rFonts w:ascii="Calibri" w:cs="Calibri" w:eastAsia="Calibri" w:hAnsi="Calibri"/>
+          <w:i w:val="0"/>
+          <w:iCs w:val="0"/>
+          <w:smallCaps w:val="0"/>
+          <w:strike w:val="0"/>
+          <w:color w:val="000000"/>
+          <w:sz w:val="22"/>
+          <w:szCs w:val="22"/>
+          <w:u w:val="none"/>
+          <w:shd w:fill="auto" w:val="clear"/>
+          <w:vertAlign w:val="baseline"/>
+          <w:rtl w:val="0"/>
+        </w:rPr>
+        <w:t xml:space="preserve"> el gestor o el Administrador la anulan antes de la OC, con motivo; se avisa al supervisor y al líder.</w:t>
+      </w:r>
+    </w:p>
+    <w:p>
+      <w:pPr>
+        <w:keepNext w:val="0"/>
+        <w:keepLines w:val="0"/>
+        <w:pageBreakBefore w:val="0"/>
+        <w:widowControl w:val="1"/>
+        <w:numPr>
+          <w:ilvl w:val="0"/>
+          <w:numId w:val="1"/>
+        </w:numPr>
+        <w:pBdr>
+          <w:top w:space="0" w:sz="0" w:val="nil"/>
+          <w:left w:space="0" w:sz="0" w:val="nil"/>
+          <w:bottom w:space="0" w:sz="0" w:val="nil"/>
+          <w:right w:space="0" w:sz="0" w:val="nil"/>
+          <w:between w:space="0" w:sz="0" w:val="nil"/>
+        </w:pBdr>
+        <w:shd w:fill="auto" w:val="clear"/>
+        <w:spacing w:after="200" w:before="0" w:line="276" w:lineRule="auto"/>
+        <w:ind w:left="360" w:right="0" w:hanging="360"/>
+        <w:jc w:val="left"/>
+        <w:rPr/>
+      </w:pPr>
+      <w:r>
+        <w:rPr>
+          <w:b/>
+          <w:rFonts w:ascii="Calibri" w:cs="Calibri" w:eastAsia="Calibri" w:hAnsi="Calibri"/>
+          <w:i w:val="0"/>
+          <w:iCs w:val="0"/>
+          <w:smallCaps w:val="0"/>
+          <w:strike w:val="0"/>
+          <w:color w:val="000000"/>
+          <w:sz w:val="22"/>
+          <w:szCs w:val="22"/>
+          <w:u w:val="none"/>
+          <w:shd w:fill="auto" w:val="clear"/>
+          <w:vertAlign w:val="baseline"/>
+          <w:rtl w:val="0"/>
+        </w:rPr>
+        <w:t xml:space="preserve">Cambiar gestor:</w:t>
+      </w:r>
+      <w:r>
+        <w:rPr>
+          <w:rFonts w:ascii="Calibri" w:cs="Calibri" w:eastAsia="Calibri" w:hAnsi="Calibri"/>
+          <w:i w:val="0"/>
+          <w:iCs w:val="0"/>
+          <w:smallCaps w:val="0"/>
+          <w:strike w:val="0"/>
+          <w:color w:val="000000"/>
+          <w:sz w:val="22"/>
+          <w:szCs w:val="22"/>
+          <w:u w:val="none"/>
+          <w:shd w:fill="auto" w:val="clear"/>
+          <w:vertAlign w:val="baseline"/>
+          <w:rtl w:val="0"/>
+        </w:rPr>
+        <w:t xml:space="preserve"> reasignar la solicitud a otro usuario de Compras, con aviso por correo.</w:t>
+      </w:r>
+    </w:p>
+    <w:p>
+      <w:pPr>
+        <w:rPr/>
+      </w:pPr>
+      <w:r>
+        <w:rPr>
+          <w:b/>
+          <w:rtl w:val="0"/>
+        </w:rPr>
+        <w:t xml:space="preserve">Roles afectados: </w:t>
+      </w:r>
+      <w:r>
+        <w:rPr>
+          <w:rtl w:val="0"/>
+        </w:rPr>
+        <w:t xml:space="preserve">Compras, Supervisor, Líder Aprobador, Administrador.</w:t>
+      </w:r>
+    </w:p>
+    <w:p>
+      <w:pPr>
+        <w:pStyle w:val="Heading2"/>
+        <w:rPr/>
+      </w:pPr>
+      <w:r>
+        <w:rPr>
+          <w:rtl w:val="0"/>
+        </w:rPr>
+        <w:t xml:space="preserve">JURICOM 1.1 — 07/10/2026</w:t>
+      </w:r>
+    </w:p>
+    <w:p>
+      <w:pPr>
+        <w:keepNext w:val="0"/>
+        <w:keepLines w:val="0"/>
+        <w:pageBreakBefore w:val="0"/>
+        <w:widowControl w:val="1"/>
+        <w:numPr>
+          <w:ilvl w:val="0"/>
+          <w:numId w:val="1"/>
+        </w:numPr>
+        <w:pBdr>
+          <w:top w:space="0" w:sz="0" w:val="nil"/>
+          <w:left w:space="0" w:sz="0" w:val="nil"/>
+          <w:bottom w:space="0" w:sz="0" w:val="nil"/>
+          <w:right w:space="0" w:sz="0" w:val="nil"/>
+          <w:between w:space="0" w:sz="0" w:val="nil"/>
+        </w:pBdr>
+        <w:shd w:fill="auto" w:val="clear"/>
+        <w:spacing w:after="200" w:before="0" w:line="276" w:lineRule="auto"/>
+        <w:ind w:left="360" w:right="0" w:hanging="360"/>
+        <w:jc w:val="left"/>
+        <w:rPr/>
+      </w:pPr>
+      <w:r>
+        <w:rPr>
+          <w:b/>
+          <w:rFonts w:ascii="Calibri" w:cs="Calibri" w:eastAsia="Calibri" w:hAnsi="Calibri"/>
+          <w:i w:val="0"/>
+          <w:iCs w:val="0"/>
+          <w:smallCaps w:val="0"/>
+          <w:strike w:val="0"/>
+          <w:color w:val="000000"/>
+          <w:sz w:val="22"/>
+          <w:szCs w:val="22"/>
+          <w:u w:val="none"/>
+          <w:shd w:fill="auto" w:val="clear"/>
+          <w:vertAlign w:val="baseline"/>
+          <w:rtl w:val="0"/>
+        </w:rPr>
+        <w:t xml:space="preserve">Comité técnico:</w:t>
+      </w:r>
+      <w:r>
+        <w:rPr>
+          <w:rFonts w:ascii="Calibri" w:cs="Calibri" w:eastAsia="Calibri" w:hAnsi="Calibri"/>
+          <w:i w:val="0"/>
+          <w:iCs w:val="0"/>
+          <w:smallCaps w:val="0"/>
+          <w:strike w:val="0"/>
+          <w:color w:val="000000"/>
+          <w:sz w:val="22"/>
+          <w:szCs w:val="22"/>
+          <w:u w:val="none"/>
+          <w:shd w:fill="auto" w:val="clear"/>
+          <w:vertAlign w:val="baseline"/>
+          <w:rtl w:val="0"/>
+        </w:rPr>
+        <w:t xml:space="preserve"> mantenimiento puede ver las SRV en comité y sus cotizaciones (solo lectura).</w:t>
+      </w:r>
+    </w:p>
+    <w:p>
+      <w:pPr>
+        <w:keepNext w:val="0"/>
+        <w:keepLines w:val="0"/>
+        <w:pageBreakBefore w:val="0"/>
+        <w:widowControl w:val="1"/>
+        <w:numPr>
+          <w:ilvl w:val="0"/>
+          <w:numId w:val="1"/>
+        </w:numPr>
+        <w:pBdr>
+          <w:top w:space="0" w:sz="0" w:val="nil"/>
+          <w:left w:space="0" w:sz="0" w:val="nil"/>
+          <w:bottom w:space="0" w:sz="0" w:val="nil"/>
+          <w:right w:space="0" w:sz="0" w:val="nil"/>
+          <w:between w:space="0" w:sz="0" w:val="nil"/>
+        </w:pBdr>
+        <w:shd w:fill="auto" w:val="clear"/>
+        <w:spacing w:after="200" w:before="0" w:line="276" w:lineRule="auto"/>
+        <w:ind w:left="360" w:right="0" w:hanging="360"/>
+        <w:jc w:val="left"/>
+        <w:rPr/>
+      </w:pPr>
+      <w:r>
+        <w:rPr>
+          <w:b/>
+          <w:rFonts w:ascii="Calibri" w:cs="Calibri" w:eastAsia="Calibri" w:hAnsi="Calibri"/>
+          <w:i w:val="0"/>
+          <w:iCs w:val="0"/>
+          <w:smallCaps w:val="0"/>
+          <w:strike w:val="0"/>
+          <w:color w:val="000000"/>
+          <w:sz w:val="22"/>
+          <w:szCs w:val="22"/>
+          <w:u w:val="none"/>
+          <w:shd w:fill="auto" w:val="clear"/>
+          <w:vertAlign w:val="baseline"/>
+          <w:rtl w:val="0"/>
+        </w:rPr>
+        <w:t xml:space="preserve">Manuales por rol:</w:t>
+      </w:r>
+      <w:r>
+        <w:rPr>
+          <w:rFonts w:ascii="Calibri" w:cs="Calibri" w:eastAsia="Calibri" w:hAnsi="Calibri"/>
+          <w:i w:val="0"/>
+          <w:iCs w:val="0"/>
+          <w:smallCaps w:val="0"/>
+          <w:strike w:val="0"/>
+          <w:color w:val="000000"/>
+          <w:sz w:val="22"/>
+          <w:szCs w:val="22"/>
+          <w:u w:val="none"/>
+          <w:shd w:fill="auto" w:val="clear"/>
+          <w:vertAlign w:val="baseline"/>
+          <w:rtl w:val="0"/>
+        </w:rPr>
+        <w:t xml:space="preserve"> cada usuario recibió por correo el manual de sus roles.</w:t>
+      </w:r>
+    </w:p>
+    <w:p>
+      <w:pPr>
+        <w:keepNext w:val="0"/>
+        <w:keepLines w:val="0"/>
+        <w:pageBreakBefore w:val="0"/>
+        <w:widowControl w:val="1"/>
+        <w:numPr>
+          <w:ilvl w:val="0"/>
+          <w:numId w:val="1"/>
+        </w:numPr>
+        <w:pBdr>
+          <w:top w:space="0" w:sz="0" w:val="nil"/>
+          <w:left w:space="0" w:sz="0" w:val="nil"/>
+          <w:bottom w:space="0" w:sz="0" w:val="nil"/>
+          <w:right w:space="0" w:sz="0" w:val="nil"/>
+          <w:between w:space="0" w:sz="0" w:val="nil"/>
+        </w:pBdr>
+        <w:shd w:fill="auto" w:val="clear"/>
+        <w:spacing w:after="200" w:before="0" w:line="276" w:lineRule="auto"/>
+        <w:ind w:left="360" w:right="0" w:hanging="360"/>
+        <w:jc w:val="left"/>
+        <w:rPr/>
+      </w:pPr>
+      <w:r>
+        <w:rPr>
+          <w:b/>
+          <w:rFonts w:ascii="Calibri" w:cs="Calibri" w:eastAsia="Calibri" w:hAnsi="Calibri"/>
+          <w:i w:val="0"/>
+          <w:iCs w:val="0"/>
+          <w:smallCaps w:val="0"/>
+          <w:strike w:val="0"/>
+          <w:color w:val="000000"/>
+          <w:sz w:val="22"/>
+          <w:szCs w:val="22"/>
+          <w:u w:val="none"/>
+          <w:shd w:fill="auto" w:val="clear"/>
+          <w:vertAlign w:val="baseline"/>
+          <w:rtl w:val="0"/>
+        </w:rPr>
+        <w:t xml:space="preserve">Corrección:</w:t>
+      </w:r>
+      <w:r>
+        <w:rPr>
+          <w:rFonts w:ascii="Calibri" w:cs="Calibri" w:eastAsia="Calibri" w:hAnsi="Calibri"/>
+          <w:i w:val="0"/>
+          <w:iCs w:val="0"/>
+          <w:smallCaps w:val="0"/>
+          <w:strike w:val="0"/>
+          <w:color w:val="000000"/>
+          <w:sz w:val="22"/>
+          <w:szCs w:val="22"/>
+          <w:u w:val="none"/>
+          <w:shd w:fill="auto" w:val="clear"/>
+          <w:vertAlign w:val="baseline"/>
+          <w:rtl w:val="0"/>
+        </w:rPr>
+        <w:t xml:space="preserve"> nombre correcto del usuario de Gerencia General.</w:t>
+      </w:r>
+    </w:p>
+    <w:p>
+      <w:pPr>
+        <w:keepNext w:val="0"/>
+        <w:keepLines w:val="0"/>
+        <w:pageBreakBefore w:val="0"/>
+        <w:widowControl w:val="1"/>
+        <w:numPr>
+          <w:ilvl w:val="0"/>
+          <w:numId w:val="1"/>
+        </w:numPr>
+        <w:pBdr>
+          <w:top w:space="0" w:sz="0" w:val="nil"/>
+          <w:left w:space="0" w:sz="0" w:val="nil"/>
+          <w:bottom w:space="0" w:sz="0" w:val="nil"/>
+          <w:right w:space="0" w:sz="0" w:val="nil"/>
+          <w:between w:space="0" w:sz="0" w:val="nil"/>
+        </w:pBdr>
+        <w:shd w:fill="auto" w:val="clear"/>
+        <w:spacing w:after="200" w:before="0" w:line="276" w:lineRule="auto"/>
+        <w:ind w:left="360" w:right="0" w:hanging="360"/>
+        <w:jc w:val="left"/>
+        <w:rPr/>
+      </w:pPr>
+      <w:r>
+        <w:rPr>
+          <w:b/>
+          <w:rFonts w:ascii="Calibri" w:cs="Calibri" w:eastAsia="Calibri" w:hAnsi="Calibri"/>
+          <w:i w:val="0"/>
+          <w:iCs w:val="0"/>
+          <w:smallCaps w:val="0"/>
+          <w:strike w:val="0"/>
+          <w:color w:val="000000"/>
+          <w:sz w:val="22"/>
+          <w:szCs w:val="22"/>
+          <w:u w:val="none"/>
+          <w:shd w:fill="auto" w:val="clear"/>
+          <w:vertAlign w:val="baseline"/>
+          <w:rtl w:val="0"/>
+        </w:rPr>
+        <w:t xml:space="preserve">Diagramas de flujo</w:t>
+      </w:r>
+      <w:r>
+        <w:rPr>
+          <w:rFonts w:ascii="Calibri" w:cs="Calibri" w:eastAsia="Calibri" w:hAnsi="Calibri"/>
+          <w:i w:val="0"/>
+          <w:iCs w:val="0"/>
+          <w:smallCaps w:val="0"/>
+          <w:strike w:val="0"/>
+          <w:color w:val="000000"/>
+          <w:sz w:val="22"/>
+          <w:szCs w:val="22"/>
+          <w:u w:val="none"/>
+          <w:shd w:fill="auto" w:val="clear"/>
+          <w:vertAlign w:val="baseline"/>
+          <w:rtl w:val="0"/>
+        </w:rPr>
+        <w:t xml:space="preserve"> de Compras, Salidas de Almacén, Salida de Consumibles y Servicios con Contrato u OS.</w:t>
+      </w:r>
+    </w:p>
+    <w:p>
+      <w:pPr>
+        <w:rPr/>
+      </w:pPr>
+      <w:r>
+        <w:rPr>
+          <w:b/>
+          <w:rtl w:val="0"/>
+        </w:rPr>
+        <w:t xml:space="preserve">Roles afectados: </w:t>
+      </w:r>
+      <w:r>
+        <w:rPr>
+          <w:rtl w:val="0"/>
+        </w:rPr>
+        <w:t xml:space="preserve">Supervisor (mantenimiento), Proyectos, todos (manuales).</w:t>
+      </w:r>
+    </w:p>
+    <w:p>
+      <w:pPr>
+        <w:pStyle w:val="Heading2"/>
+        <w:rPr/>
+      </w:pPr>
+      <w:r>
+        <w:rPr>
+          <w:rtl w:val="0"/>
+        </w:rPr>
+        <w:t xml:space="preserve">JURICOM 1.0 — hasta 05/10/2026</w:t>
+      </w:r>
+    </w:p>
+    <w:p>
+      <w:pPr>
+        <w:keepNext w:val="0"/>
+        <w:keepLines w:val="0"/>
+        <w:pageBreakBefore w:val="0"/>
+        <w:widowControl w:val="1"/>
+        <w:numPr>
+          <w:ilvl w:val="0"/>
+          <w:numId w:val="1"/>
+        </w:numPr>
+        <w:pBdr>
+          <w:top w:space="0" w:sz="0" w:val="nil"/>
+          <w:left w:space="0" w:sz="0" w:val="nil"/>
+          <w:bottom w:space="0" w:sz="0" w:val="nil"/>
+          <w:right w:space="0" w:sz="0" w:val="nil"/>
+          <w:between w:space="0" w:sz="0" w:val="nil"/>
+        </w:pBdr>
+        <w:shd w:fill="auto" w:val="clear"/>
+        <w:spacing w:after="200" w:before="0" w:line="276" w:lineRule="auto"/>
+        <w:ind w:left="360" w:right="0" w:hanging="360"/>
+        <w:jc w:val="left"/>
+        <w:rPr/>
+      </w:pPr>
+      <w:r>
+        <w:rPr>
+          <w:b/>
+          <w:rFonts w:ascii="Calibri" w:cs="Calibri" w:eastAsia="Calibri" w:hAnsi="Calibri"/>
+          <w:i w:val="0"/>
+          <w:iCs w:val="0"/>
+          <w:smallCaps w:val="0"/>
+          <w:strike w:val="0"/>
+          <w:color w:val="000000"/>
+          <w:sz w:val="22"/>
+          <w:szCs w:val="22"/>
+          <w:u w:val="none"/>
+          <w:shd w:fill="auto" w:val="clear"/>
+          <w:vertAlign w:val="baseline"/>
+          <w:rtl w:val="0"/>
+        </w:rPr>
+        <w:t xml:space="preserve">Solicitudes:</w:t>
+      </w:r>
+      <w:r>
+        <w:rPr>
+          <w:rFonts w:ascii="Calibri" w:cs="Calibri" w:eastAsia="Calibri" w:hAnsi="Calibri"/>
+          <w:i w:val="0"/>
+          <w:iCs w:val="0"/>
+          <w:smallCaps w:val="0"/>
+          <w:strike w:val="0"/>
+          <w:color w:val="000000"/>
+          <w:sz w:val="22"/>
+          <w:szCs w:val="22"/>
+          <w:u w:val="none"/>
+          <w:shd w:fill="auto" w:val="clear"/>
+          <w:vertAlign w:val="baseline"/>
+          <w:rtl w:val="0"/>
+        </w:rPr>
+        <w:t xml:space="preserve"> Compras, Salidas de Almacén, Salida de Consumibles y Servicios con comité técnico.</w:t>
+      </w:r>
+    </w:p>
+    <w:p>
+      <w:pPr>
+        <w:keepNext w:val="0"/>
+        <w:keepLines w:val="0"/>
+        <w:pageBreakBefore w:val="0"/>
+        <w:widowControl w:val="1"/>
+        <w:numPr>
+          <w:ilvl w:val="0"/>
+          <w:numId w:val="1"/>
+        </w:numPr>
+        <w:pBdr>
+          <w:top w:space="0" w:sz="0" w:val="nil"/>
+          <w:left w:space="0" w:sz="0" w:val="nil"/>
+          <w:bottom w:space="0" w:sz="0" w:val="nil"/>
+          <w:right w:space="0" w:sz="0" w:val="nil"/>
+          <w:between w:space="0" w:sz="0" w:val="nil"/>
+        </w:pBdr>
+        <w:shd w:fill="auto" w:val="clear"/>
+        <w:spacing w:after="200" w:before="0" w:line="276" w:lineRule="auto"/>
+        <w:ind w:left="360" w:right="0" w:hanging="360"/>
+        <w:jc w:val="left"/>
+        <w:rPr/>
+      </w:pPr>
+      <w:r>
+        <w:rPr>
+          <w:b/>
+          <w:rFonts w:ascii="Calibri" w:cs="Calibri" w:eastAsia="Calibri" w:hAnsi="Calibri"/>
+          <w:i w:val="0"/>
+          <w:iCs w:val="0"/>
+          <w:smallCaps w:val="0"/>
+          <w:strike w:val="0"/>
+          <w:color w:val="000000"/>
+          <w:sz w:val="22"/>
+          <w:szCs w:val="22"/>
+          <w:u w:val="none"/>
+          <w:shd w:fill="auto" w:val="clear"/>
+          <w:vertAlign w:val="baseline"/>
+          <w:rtl w:val="0"/>
+        </w:rPr>
+        <w:t xml:space="preserve">Segunda aprobación:</w:t>
+      </w:r>
+      <w:r>
+        <w:rPr>
+          <w:rFonts w:ascii="Calibri" w:cs="Calibri" w:eastAsia="Calibri" w:hAnsi="Calibri"/>
+          <w:i w:val="0"/>
+          <w:iCs w:val="0"/>
+          <w:smallCaps w:val="0"/>
+          <w:strike w:val="0"/>
+          <w:color w:val="000000"/>
+          <w:sz w:val="22"/>
+          <w:szCs w:val="22"/>
+          <w:u w:val="none"/>
+          <w:shd w:fill="auto" w:val="clear"/>
+          <w:vertAlign w:val="baseline"/>
+          <w:rtl w:val="0"/>
+        </w:rPr>
+        <w:t xml:space="preserve"> Compras elige líder, Gerencia Financiera o Gerencia General.</w:t>
+      </w:r>
+    </w:p>
+    <w:p>
+      <w:pPr>
+        <w:keepNext w:val="0"/>
+        <w:keepLines w:val="0"/>
+        <w:pageBreakBefore w:val="0"/>
+        <w:widowControl w:val="1"/>
+        <w:numPr>
+          <w:ilvl w:val="0"/>
+          <w:numId w:val="1"/>
+        </w:numPr>
+        <w:pBdr>
+          <w:top w:space="0" w:sz="0" w:val="nil"/>
+          <w:left w:space="0" w:sz="0" w:val="nil"/>
+          <w:bottom w:space="0" w:sz="0" w:val="nil"/>
+          <w:right w:space="0" w:sz="0" w:val="nil"/>
+          <w:between w:space="0" w:sz="0" w:val="nil"/>
+        </w:pBdr>
+        <w:shd w:fill="auto" w:val="clear"/>
+        <w:spacing w:after="200" w:before="0" w:line="276" w:lineRule="auto"/>
+        <w:ind w:left="360" w:right="0" w:hanging="360"/>
+        <w:jc w:val="left"/>
+        <w:rPr/>
+      </w:pPr>
+      <w:r>
+        <w:rPr>
+          <w:b/>
+          <w:rFonts w:ascii="Calibri" w:cs="Calibri" w:eastAsia="Calibri" w:hAnsi="Calibri"/>
+          <w:i w:val="0"/>
+          <w:iCs w:val="0"/>
+          <w:smallCaps w:val="0"/>
+          <w:strike w:val="0"/>
+          <w:color w:val="000000"/>
+          <w:sz w:val="22"/>
+          <w:szCs w:val="22"/>
+          <w:u w:val="none"/>
+          <w:shd w:fill="auto" w:val="clear"/>
+          <w:vertAlign w:val="baseline"/>
+          <w:rtl w:val="0"/>
+        </w:rPr>
+        <w:t xml:space="preserve">Jurídica:</w:t>
+      </w:r>
+      <w:r>
+        <w:rPr>
+          <w:rFonts w:ascii="Calibri" w:cs="Calibri" w:eastAsia="Calibri" w:hAnsi="Calibri"/>
+          <w:i w:val="0"/>
+          <w:iCs w:val="0"/>
+          <w:smallCaps w:val="0"/>
+          <w:strike w:val="0"/>
+          <w:color w:val="000000"/>
+          <w:sz w:val="22"/>
+          <w:szCs w:val="22"/>
+          <w:u w:val="none"/>
+          <w:shd w:fill="auto" w:val="clear"/>
+          <w:vertAlign w:val="baseline"/>
+          <w:rtl w:val="0"/>
+        </w:rPr>
+        <w:t xml:space="preserve"> contratos y órdenes de servicio, pólizas, firmas, anticipos, otrosíes y cierre.</w:t>
+      </w:r>
+    </w:p>
+    <w:p>
+      <w:pPr>
+        <w:keepNext w:val="0"/>
+        <w:keepLines w:val="0"/>
+        <w:pageBreakBefore w:val="0"/>
+        <w:widowControl w:val="1"/>
+        <w:numPr>
+          <w:ilvl w:val="0"/>
+          <w:numId w:val="1"/>
+        </w:numPr>
+        <w:pBdr>
+          <w:top w:space="0" w:sz="0" w:val="nil"/>
+          <w:left w:space="0" w:sz="0" w:val="nil"/>
+          <w:bottom w:space="0" w:sz="0" w:val="nil"/>
+          <w:right w:space="0" w:sz="0" w:val="nil"/>
+          <w:between w:space="0" w:sz="0" w:val="nil"/>
+        </w:pBdr>
+        <w:shd w:fill="auto" w:val="clear"/>
+        <w:spacing w:after="200" w:before="0" w:line="276" w:lineRule="auto"/>
+        <w:ind w:left="360" w:right="0" w:hanging="360"/>
+        <w:jc w:val="left"/>
+        <w:rPr/>
+      </w:pPr>
+      <w:r>
+        <w:rPr>
+          <w:b/>
+          <w:rFonts w:ascii="Calibri" w:cs="Calibri" w:eastAsia="Calibri" w:hAnsi="Calibri"/>
+          <w:i w:val="0"/>
+          <w:iCs w:val="0"/>
+          <w:smallCaps w:val="0"/>
+          <w:strike w:val="0"/>
+          <w:color w:val="000000"/>
+          <w:sz w:val="22"/>
+          <w:szCs w:val="22"/>
+          <w:u w:val="none"/>
+          <w:shd w:fill="auto" w:val="clear"/>
+          <w:vertAlign w:val="baseline"/>
+          <w:rtl w:val="0"/>
+        </w:rPr>
+        <w:t xml:space="preserve">Varios roles</w:t>
+      </w:r>
+      <w:r>
+        <w:rPr>
+          <w:rFonts w:ascii="Calibri" w:cs="Calibri" w:eastAsia="Calibri" w:hAnsi="Calibri"/>
+          <w:i w:val="0"/>
+          <w:iCs w:val="0"/>
+          <w:smallCaps w:val="0"/>
+          <w:strike w:val="0"/>
+          <w:color w:val="000000"/>
+          <w:sz w:val="22"/>
+          <w:szCs w:val="22"/>
+          <w:u w:val="none"/>
+          <w:shd w:fill="auto" w:val="clear"/>
+          <w:vertAlign w:val="baseline"/>
+          <w:rtl w:val="0"/>
+        </w:rPr>
+        <w:t xml:space="preserve"> por usuario (por ejemplo Supervisor + Jurídica).</w:t>
+      </w:r>
+    </w:p>
+    <w:p>
+      <w:pPr>
+        <w:rPr/>
+      </w:pPr>
+      <w:r>
+        <w:rPr>
+          <w:b/>
+          <w:rtl w:val="0"/>
+        </w:rPr>
+        <w:t xml:space="preserve">Roles afectados: </w:t>
+      </w:r>
+      <w:r>
+        <w:rPr>
+          <w:rtl w:val="0"/>
+        </w:rPr>
+        <w:t xml:space="preserve">Todos.</w:t>
       </w:r>
     </w:p>
     <w:sectPr>

</xml_diff>

<commit_message>
docs: registrar JURICOM 1.3 y actualizar manuales
Co-authored-by: Cursor <cursoragent@cursor.com>
</commit_message>
<xml_diff>
--- a/docs/manual-usuario/Manual-de-Usuario-JURICOM.docx
+++ b/docs/manual-usuario/Manual-de-Usuario-JURICOM.docx
@@ -7591,6 +7591,14 @@
     </w:p>
     <w:p>
       <w:pPr>
+        <w:rPr/>
+      </w:pPr>
+      <w:r>
+        <w:t>En Aprobar solicitudes también consulta las decisiones de todos los aprobadores, con el nombre de quien decidió, la fecha y el estado actual.</w:t>
+      </w:r>
+    </w:p>
+    <w:p>
+      <w:pPr>
         <w:pStyle w:val="Heading2"/>
         <w:rPr/>
       </w:pPr>
@@ -11570,39 +11578,7 @@
         <w:rPr/>
       </w:pPr>
       <w:r>
-        <w:rPr>
-          <w:b/>
-          <w:rFonts w:ascii="Calibri" w:cs="Calibri" w:eastAsia="Calibri" w:hAnsi="Calibri"/>
-          <w:i w:val="0"/>
-          <w:iCs w:val="0"/>
-          <w:smallCaps w:val="0"/>
-          <w:strike w:val="0"/>
-          <w:color w:val="000000"/>
-          <w:sz w:val="22"/>
-          <w:szCs w:val="22"/>
-          <w:u w:val="none"/>
-          <w:shd w:fill="auto" w:val="clear"/>
-          <w:vertAlign w:val="baseline"/>
-          <w:rtl w:val="0"/>
-        </w:rPr>
-        <w:t xml:space="preserve">Columna Gestor:</w:t>
-      </w:r>
-      <w:r>
-        <w:rPr>
-          <w:rFonts w:ascii="Calibri" w:cs="Calibri" w:eastAsia="Calibri" w:hAnsi="Calibri"/>
-          <w:i w:val="0"/>
-          <w:iCs w:val="0"/>
-          <w:smallCaps w:val="0"/>
-          <w:strike w:val="0"/>
-          <w:color w:val="000000"/>
-          <w:sz w:val="22"/>
-          <w:szCs w:val="22"/>
-          <w:u w:val="none"/>
-          <w:shd w:fill="auto" w:val="clear"/>
-          <w:vertAlign w:val="baseline"/>
-          <w:rtl w:val="0"/>
-        </w:rPr>
-        <w:t xml:space="preserve"> muestra quién gestiona cada solicitud, o "Sin gestor" si nadie la ha tomado.</w:t>
+        <w:t>Columna Gestor: muestra el nombre registrado de quien gestiona la solicitud, o "Sin gestor" si nadie la ha tomado. Si la cuenta no tiene nombre, muestra su correo.</w:t>
       </w:r>
     </w:p>
     <w:p>
@@ -15065,6 +15041,14 @@
     </w:p>
     <w:p>
       <w:pPr>
+        <w:rPr/>
+      </w:pPr>
+      <w:r>
+        <w:t>Debajo de las solicitudes pendientes, la sección Solicitudes que ya revisaste muestra lo que aprobaste, rechazaste o devolviste, la fecha de tu decisión y el estado actual. Desde Ver puedes consultar el detalle en modo lectura.</w:t>
+      </w:r>
+    </w:p>
+    <w:p>
+      <w:pPr>
         <w:shd w:fill="fff7e6" w:val="clear"/>
         <w:ind w:left="360" w:firstLine="0"/>
         <w:rPr/>
@@ -18157,6 +18141,128 @@
           <w:rtl w:val="0"/>
         </w:rPr>
         <w:t xml:space="preserve">Cambios de JURICOM por versión. La versión más reciente va primero.</w:t>
+      </w:r>
+    </w:p>
+    <w:p>
+      <w:pPr>
+        <w:pStyle w:val="Heading2"/>
+        <w:rPr/>
+      </w:pPr>
+      <w:r>
+        <w:t>JURICOM 1.3 — 08/10/2026</w:t>
+      </w:r>
+    </w:p>
+    <w:p>
+      <w:pPr>
+        <w:keepNext w:val="0"/>
+        <w:keepLines w:val="0"/>
+        <w:pageBreakBefore w:val="0"/>
+        <w:widowControl w:val="1"/>
+        <w:numPr>
+          <w:ilvl w:val="0"/>
+          <w:numId w:val="1"/>
+        </w:numPr>
+        <w:pBdr>
+          <w:top w:space="0" w:sz="0" w:val="nil"/>
+          <w:left w:space="0" w:sz="0" w:val="nil"/>
+          <w:bottom w:space="0" w:sz="0" w:val="nil"/>
+          <w:right w:space="0" w:sz="0" w:val="nil"/>
+          <w:between w:space="0" w:sz="0" w:val="nil"/>
+        </w:pBdr>
+        <w:shd w:fill="auto" w:val="clear"/>
+        <w:spacing w:after="200" w:before="0" w:line="276" w:lineRule="auto"/>
+        <w:ind w:left="360" w:right="0" w:hanging="360"/>
+        <w:jc w:val="left"/>
+        <w:rPr/>
+      </w:pPr>
+      <w:r>
+        <w:rPr>
+          <w:b/>
+        </w:rPr>
+        <w:t xml:space="preserve">Aprobaciones: </w:t>
+      </w:r>
+      <w:r>
+        <w:t>cada aprobador consulta las solicitudes que ya revisó, su decisión, fecha y estado actual.</w:t>
+      </w:r>
+    </w:p>
+    <w:p>
+      <w:pPr>
+        <w:keepNext w:val="0"/>
+        <w:keepLines w:val="0"/>
+        <w:pageBreakBefore w:val="0"/>
+        <w:widowControl w:val="1"/>
+        <w:numPr>
+          <w:ilvl w:val="0"/>
+          <w:numId w:val="1"/>
+        </w:numPr>
+        <w:pBdr>
+          <w:top w:space="0" w:sz="0" w:val="nil"/>
+          <w:left w:space="0" w:sz="0" w:val="nil"/>
+          <w:bottom w:space="0" w:sz="0" w:val="nil"/>
+          <w:right w:space="0" w:sz="0" w:val="nil"/>
+          <w:between w:space="0" w:sz="0" w:val="nil"/>
+        </w:pBdr>
+        <w:shd w:fill="auto" w:val="clear"/>
+        <w:spacing w:after="200" w:before="0" w:line="276" w:lineRule="auto"/>
+        <w:ind w:left="360" w:right="0" w:hanging="360"/>
+        <w:jc w:val="left"/>
+        <w:rPr/>
+      </w:pPr>
+      <w:r>
+        <w:rPr>
+          <w:b/>
+        </w:rPr>
+        <w:t xml:space="preserve">Vista de Administrador: </w:t>
+      </w:r>
+      <w:r>
+        <w:t>muestra las decisiones de todos y el nombre de quien decidió.</w:t>
+      </w:r>
+    </w:p>
+    <w:p>
+      <w:pPr>
+        <w:keepNext w:val="0"/>
+        <w:keepLines w:val="0"/>
+        <w:pageBreakBefore w:val="0"/>
+        <w:widowControl w:val="1"/>
+        <w:numPr>
+          <w:ilvl w:val="0"/>
+          <w:numId w:val="1"/>
+        </w:numPr>
+        <w:pBdr>
+          <w:top w:space="0" w:sz="0" w:val="nil"/>
+          <w:left w:space="0" w:sz="0" w:val="nil"/>
+          <w:bottom w:space="0" w:sz="0" w:val="nil"/>
+          <w:right w:space="0" w:sz="0" w:val="nil"/>
+          <w:between w:space="0" w:sz="0" w:val="nil"/>
+        </w:pBdr>
+        <w:shd w:fill="auto" w:val="clear"/>
+        <w:spacing w:after="200" w:before="0" w:line="276" w:lineRule="auto"/>
+        <w:ind w:left="360" w:right="0" w:hanging="360"/>
+        <w:jc w:val="left"/>
+        <w:rPr/>
+      </w:pPr>
+      <w:r>
+        <w:rPr>
+          <w:b/>
+        </w:rPr>
+        <w:t xml:space="preserve">Nombre del gestor: </w:t>
+      </w:r>
+      <w:r>
+        <w:t>la columna Gestor muestra el nombre registrado, o el correo si no hay nombre.</w:t>
+      </w:r>
+    </w:p>
+    <w:p>
+      <w:pPr>
+        <w:rPr/>
+      </w:pPr>
+      <w:r>
+        <w:rPr>
+          <w:b/>
+        </w:rPr>
+        <w:t xml:space="preserve">Roles afectados: </w:t>
+      </w:r>
+      <w:r>
+        <w:t>Líder Aprobador, Administrador, Compras.</w:t>
       </w:r>
     </w:p>
     <w:p>

</xml_diff>

<commit_message>
JURICOM 1.4: centro de costo por consumible
Co-authored-by: Cursor <cursoragent@cursor.com>
</commit_message>
<xml_diff>
--- a/docs/manual-usuario/Manual-de-Usuario-JURICOM.docx
+++ b/docs/manual-usuario/Manual-de-Usuario-JURICOM.docx
@@ -9590,6 +9590,14 @@
     </w:p>
     <w:p>
       <w:pPr>
+        <w:rPr/>
+      </w:pPr>
+      <w:r>
+        <w:t>En Salida de Consumibles, cada fila exige un centro de costo. El formulario propone el centro general, pero puedes cambiarlo para cada consumible.</w:t>
+      </w:r>
+    </w:p>
+    <w:p>
+      <w:pPr>
         <w:keepNext w:val="0"/>
         <w:keepLines w:val="0"/>
         <w:pageBreakBefore w:val="0"/>
@@ -18141,6 +18149,62 @@
           <w:rtl w:val="0"/>
         </w:rPr>
         <w:t xml:space="preserve">Cambios de JURICOM por versión. La versión más reciente va primero.</w:t>
+      </w:r>
+    </w:p>
+    <w:p>
+      <w:pPr>
+        <w:pStyle w:val="Heading2"/>
+        <w:rPr/>
+      </w:pPr>
+      <w:r>
+        <w:t>JURICOM 1.4 — 09/10/2026</w:t>
+      </w:r>
+    </w:p>
+    <w:p>
+      <w:pPr>
+        <w:keepNext w:val="0"/>
+        <w:keepLines w:val="0"/>
+        <w:pageBreakBefore w:val="0"/>
+        <w:widowControl w:val="1"/>
+        <w:numPr>
+          <w:ilvl w:val="0"/>
+          <w:numId w:val="1"/>
+        </w:numPr>
+        <w:pBdr>
+          <w:top w:space="0" w:sz="0" w:val="nil"/>
+          <w:left w:space="0" w:sz="0" w:val="nil"/>
+          <w:bottom w:space="0" w:sz="0" w:val="nil"/>
+          <w:right w:space="0" w:sz="0" w:val="nil"/>
+          <w:between w:space="0" w:sz="0" w:val="nil"/>
+        </w:pBdr>
+        <w:shd w:fill="auto" w:val="clear"/>
+        <w:spacing w:after="200" w:before="0" w:line="276" w:lineRule="auto"/>
+        <w:ind w:left="360" w:right="0" w:hanging="360"/>
+        <w:jc w:val="left"/>
+        <w:rPr/>
+      </w:pPr>
+      <w:r>
+        <w:rPr>
+          <w:b/>
+        </w:rPr>
+        <w:t xml:space="preserve">Salida de Consumibles: </w:t>
+      </w:r>
+      <w:r>
+        <w:t>cada consumible registra su propio centro de costo; comienza con el centro general y puede cambiarse por fila.</w:t>
+      </w:r>
+    </w:p>
+    <w:p>
+      <w:pPr>
+        <w:rPr/>
+      </w:pPr>
+      <w:r>
+        <w:rPr>
+          <w:b/>
+        </w:rPr>
+        <w:t xml:space="preserve">Roles afectados: </w:t>
+      </w:r>
+      <w:r>
+        <w:t>Supervisor.</w:t>
       </w:r>
     </w:p>
     <w:p>

</xml_diff>